<commit_message>
Expand document template with chart and callout examples
</commit_message>
<xml_diff>
--- a/plugins/document-style-guide/skills/artifact-template-craig-documents/assets/reference.docx
+++ b/plugins/document-style-guide/skills/artifact-template-craig-documents/assets/reference.docx
@@ -140,6 +140,57 @@
       <w:r>
         <w:tab/>
         <w:t>5</w:t>
+      </w:r>
+    </w:p>
+    <w:p>
+      <w:pPr>
+        <w:pStyle w:val="TOC1"/>
+      </w:pPr>
+      <w:hyperlink w:anchor="charts">
+        <w:r>
+          <w:rPr>
+            <w:color w:val="71218A"/>
+          </w:rPr>
+          <w:t>Charts and comparisons</w:t>
+        </w:r>
+      </w:hyperlink>
+      <w:r>
+        <w:tab/>
+        <w:t>6</w:t>
+      </w:r>
+    </w:p>
+    <w:p>
+      <w:pPr>
+        <w:pStyle w:val="TOC1"/>
+      </w:pPr>
+      <w:hyperlink w:anchor="progress">
+        <w:r>
+          <w:rPr>
+            <w:color w:val="71218A"/>
+          </w:rPr>
+          <w:t>Progress indicators</w:t>
+        </w:r>
+      </w:hyperlink>
+      <w:r>
+        <w:tab/>
+        <w:t>7</w:t>
+      </w:r>
+    </w:p>
+    <w:p>
+      <w:pPr>
+        <w:pStyle w:val="TOC1"/>
+      </w:pPr>
+      <w:hyperlink w:anchor="panels">
+        <w:r>
+          <w:rPr>
+            <w:color w:val="71218A"/>
+          </w:rPr>
+          <w:t>Callouts and key messages</w:t>
+        </w:r>
+      </w:hyperlink>
+      <w:r>
+        <w:tab/>
+        <w:t>8</w:t>
       </w:r>
       <w:r>
         <w:fldChar w:fldCharType="end"/>
@@ -624,6 +675,1008 @@
       </w:r>
     </w:p>
     <w:p>
+      <w:r>
+        <w:br w:type="page"/>
+      </w:r>
+    </w:p>
+    <w:p>
+      <w:bookmarkStart w:id="4" w:name="charts"/>
+      <w:pPr>
+        <w:pStyle w:val="Heading1"/>
+      </w:pPr>
+      <w:r>
+        <w:t>Charts and comparisons</w:t>
+      </w:r>
+      <w:bookmarkEnd w:id="4"/>
+    </w:p>
+    <w:p>
+      <w:r>
+        <w:t>A column chart makes differences easy to compare. This example uses illustrative monthly completion rates to demonstrate the gradient bars and direct value labels.</w:t>
+      </w:r>
+    </w:p>
+    <w:p>
+      <w:r>
+        <w:drawing>
+          <wp:inline xmlns:a="http://schemas.openxmlformats.org/drawingml/2006/main" xmlns:pic="http://schemas.openxmlformats.org/drawingml/2006/picture">
+            <wp:extent cx="5832000" cy="3385241"/>
+            <wp:docPr id="1" name="Picture 1"/>
+            <wp:cNvGraphicFramePr>
+              <a:graphicFrameLocks noChangeAspect="1"/>
+            </wp:cNvGraphicFramePr>
+            <a:graphic>
+              <a:graphicData uri="http://schemas.openxmlformats.org/drawingml/2006/picture">
+                <pic:pic>
+                  <pic:nvPicPr>
+                    <pic:cNvPr id="0" name="column-chart.png"/>
+                    <pic:cNvPicPr/>
+                  </pic:nvPicPr>
+                  <pic:blipFill>
+                    <a:blip r:embed="rId14"/>
+                    <a:stretch>
+                      <a:fillRect/>
+                    </a:stretch>
+                  </pic:blipFill>
+                  <pic:spPr>
+                    <a:xfrm>
+                      <a:off x="0" y="0"/>
+                      <a:ext cx="5832000" cy="3385241"/>
+                    </a:xfrm>
+                    <a:prstGeom prst="rect"/>
+                  </pic:spPr>
+                </pic:pic>
+              </a:graphicData>
+            </a:graphic>
+          </wp:inline>
+        </w:drawing>
+      </w:r>
+    </w:p>
+    <w:p>
+      <w:pPr>
+        <w:spacing w:before="100"/>
+      </w:pPr>
+      <w:r>
+        <w:rPr>
+          <w:color w:val="716A75"/>
+          <w:sz w:val="18"/>
+        </w:rPr>
+        <w:t>Figure 1  Illustrative completion rates. Example data only.</w:t>
+      </w:r>
+    </w:p>
+    <w:p>
+      <w:pPr>
+        <w:pStyle w:val="Heading2"/>
+      </w:pPr>
+      <w:r>
+        <w:t>A clear reading order</w:t>
+      </w:r>
+    </w:p>
+    <w:tbl>
+      <w:tblPr>
+        <w:tblW w:type="auto" w:w="0"/>
+        <w:tblLayout w:type="fixed"/>
+        <w:tblLook w:firstColumn="1" w:firstRow="1" w:lastColumn="0" w:lastRow="0" w:noHBand="0" w:noVBand="1" w:val="04A0"/>
+        <w:tblBorders>
+          <w:top w:val="nil"/>
+          <w:left w:val="nil"/>
+          <w:bottom w:val="nil"/>
+          <w:right w:val="nil"/>
+          <w:insideH w:val="nil"/>
+          <w:insideV w:val="nil"/>
+        </w:tblBorders>
+      </w:tblPr>
+      <w:tblGrid>
+        <w:gridCol w:w="1020"/>
+        <w:gridCol w:w="8164"/>
+      </w:tblGrid>
+      <w:tr>
+        <w:trPr>
+          <w:cantSplit/>
+        </w:trPr>
+        <w:tc>
+          <w:tcPr>
+            <w:tcW w:type="dxa" w:w="1020"/>
+            <w:vAlign w:val="center"/>
+            <w:tcMar>
+              <w:top w:w="60" w:type="dxa"/>
+              <w:left w:w="60" w:type="dxa"/>
+              <w:bottom w:w="60" w:type="dxa"/>
+              <w:right w:w="60" w:type="dxa"/>
+            </w:tcMar>
+          </w:tcPr>
+          <w:p>
+            <w:pPr>
+              <w:spacing w:after="0"/>
+            </w:pPr>
+            <w:r>
+              <w:drawing>
+                <wp:inline xmlns:a="http://schemas.openxmlformats.org/drawingml/2006/main" xmlns:pic="http://schemas.openxmlformats.org/drawingml/2006/picture">
+                  <wp:extent cx="432000" cy="432000"/>
+                  <wp:docPr id="2" name="Picture 2"/>
+                  <wp:cNvGraphicFramePr>
+                    <a:graphicFrameLocks noChangeAspect="1"/>
+                  </wp:cNvGraphicFramePr>
+                  <a:graphic>
+                    <a:graphicData uri="http://schemas.openxmlformats.org/drawingml/2006/picture">
+                      <pic:pic>
+                        <pic:nvPicPr>
+                          <pic:cNvPr id="0" name="number-1.png"/>
+                          <pic:cNvPicPr/>
+                        </pic:nvPicPr>
+                        <pic:blipFill>
+                          <a:blip r:embed="rId15"/>
+                          <a:stretch>
+                            <a:fillRect/>
+                          </a:stretch>
+                        </pic:blipFill>
+                        <pic:spPr>
+                          <a:xfrm>
+                            <a:off x="0" y="0"/>
+                            <a:ext cx="432000" cy="432000"/>
+                          </a:xfrm>
+                          <a:prstGeom prst="rect"/>
+                        </pic:spPr>
+                      </pic:pic>
+                    </a:graphicData>
+                  </a:graphic>
+                </wp:inline>
+              </w:drawing>
+            </w:r>
+          </w:p>
+        </w:tc>
+        <w:tc>
+          <w:tcPr>
+            <w:tcW w:type="dxa" w:w="8164"/>
+            <w:vAlign w:val="center"/>
+            <w:tcMar>
+              <w:top w:w="60" w:type="dxa"/>
+              <w:left w:w="60" w:type="dxa"/>
+              <w:bottom w:w="60" w:type="dxa"/>
+              <w:right w:w="60" w:type="dxa"/>
+            </w:tcMar>
+          </w:tcPr>
+          <w:p>
+            <w:pPr>
+              <w:spacing w:after="0"/>
+            </w:pPr>
+            <w:r>
+              <w:rPr>
+                <w:rFonts w:ascii="Montserrat SemiBold" w:hAnsi="Montserrat SemiBold"/>
+                <w:sz w:val="22"/>
+              </w:rPr>
+              <w:t>Explain the comparison</w:t>
+              <w:br/>
+            </w:r>
+            <w:r>
+              <w:rPr>
+                <w:sz w:val="20"/>
+              </w:rPr>
+              <w:t>Give the reader the subject, units and period before the chart.</w:t>
+            </w:r>
+          </w:p>
+        </w:tc>
+      </w:tr>
+      <w:tr>
+        <w:trPr>
+          <w:cantSplit/>
+        </w:trPr>
+        <w:tc>
+          <w:tcPr>
+            <w:tcW w:type="dxa" w:w="1020"/>
+            <w:vAlign w:val="center"/>
+            <w:tcMar>
+              <w:top w:w="60" w:type="dxa"/>
+              <w:left w:w="60" w:type="dxa"/>
+              <w:bottom w:w="60" w:type="dxa"/>
+              <w:right w:w="60" w:type="dxa"/>
+            </w:tcMar>
+          </w:tcPr>
+          <w:p>
+            <w:pPr>
+              <w:spacing w:after="0"/>
+            </w:pPr>
+            <w:r>
+              <w:drawing>
+                <wp:inline xmlns:a="http://schemas.openxmlformats.org/drawingml/2006/main" xmlns:pic="http://schemas.openxmlformats.org/drawingml/2006/picture">
+                  <wp:extent cx="432000" cy="432000"/>
+                  <wp:docPr id="3" name="Picture 3"/>
+                  <wp:cNvGraphicFramePr>
+                    <a:graphicFrameLocks noChangeAspect="1"/>
+                  </wp:cNvGraphicFramePr>
+                  <a:graphic>
+                    <a:graphicData uri="http://schemas.openxmlformats.org/drawingml/2006/picture">
+                      <pic:pic>
+                        <pic:nvPicPr>
+                          <pic:cNvPr id="0" name="number-2.png"/>
+                          <pic:cNvPicPr/>
+                        </pic:nvPicPr>
+                        <pic:blipFill>
+                          <a:blip r:embed="rId16"/>
+                          <a:stretch>
+                            <a:fillRect/>
+                          </a:stretch>
+                        </pic:blipFill>
+                        <pic:spPr>
+                          <a:xfrm>
+                            <a:off x="0" y="0"/>
+                            <a:ext cx="432000" cy="432000"/>
+                          </a:xfrm>
+                          <a:prstGeom prst="rect"/>
+                        </pic:spPr>
+                      </pic:pic>
+                    </a:graphicData>
+                  </a:graphic>
+                </wp:inline>
+              </w:drawing>
+            </w:r>
+          </w:p>
+        </w:tc>
+        <w:tc>
+          <w:tcPr>
+            <w:tcW w:type="dxa" w:w="8164"/>
+            <w:vAlign w:val="center"/>
+            <w:tcMar>
+              <w:top w:w="60" w:type="dxa"/>
+              <w:left w:w="60" w:type="dxa"/>
+              <w:bottom w:w="60" w:type="dxa"/>
+              <w:right w:w="60" w:type="dxa"/>
+            </w:tcMar>
+          </w:tcPr>
+          <w:p>
+            <w:pPr>
+              <w:spacing w:after="0"/>
+            </w:pPr>
+            <w:r>
+              <w:rPr>
+                <w:rFonts w:ascii="Montserrat SemiBold" w:hAnsi="Montserrat SemiBold"/>
+                <w:sz w:val="22"/>
+              </w:rPr>
+              <w:t>Label the values</w:t>
+              <w:br/>
+            </w:r>
+            <w:r>
+              <w:rPr>
+                <w:sz w:val="20"/>
+              </w:rPr>
+              <w:t>Show values directly and keep category labels easy to read.</w:t>
+            </w:r>
+          </w:p>
+        </w:tc>
+      </w:tr>
+      <w:tr>
+        <w:trPr>
+          <w:cantSplit/>
+        </w:trPr>
+        <w:tc>
+          <w:tcPr>
+            <w:tcW w:type="dxa" w:w="1020"/>
+            <w:vAlign w:val="center"/>
+            <w:tcMar>
+              <w:top w:w="60" w:type="dxa"/>
+              <w:left w:w="60" w:type="dxa"/>
+              <w:bottom w:w="60" w:type="dxa"/>
+              <w:right w:w="60" w:type="dxa"/>
+            </w:tcMar>
+          </w:tcPr>
+          <w:p>
+            <w:pPr>
+              <w:spacing w:after="0"/>
+            </w:pPr>
+            <w:r>
+              <w:drawing>
+                <wp:inline xmlns:a="http://schemas.openxmlformats.org/drawingml/2006/main" xmlns:pic="http://schemas.openxmlformats.org/drawingml/2006/picture">
+                  <wp:extent cx="432000" cy="432000"/>
+                  <wp:docPr id="4" name="Picture 4"/>
+                  <wp:cNvGraphicFramePr>
+                    <a:graphicFrameLocks noChangeAspect="1"/>
+                  </wp:cNvGraphicFramePr>
+                  <a:graphic>
+                    <a:graphicData uri="http://schemas.openxmlformats.org/drawingml/2006/picture">
+                      <pic:pic>
+                        <pic:nvPicPr>
+                          <pic:cNvPr id="0" name="number-3.png"/>
+                          <pic:cNvPicPr/>
+                        </pic:nvPicPr>
+                        <pic:blipFill>
+                          <a:blip r:embed="rId17"/>
+                          <a:stretch>
+                            <a:fillRect/>
+                          </a:stretch>
+                        </pic:blipFill>
+                        <pic:spPr>
+                          <a:xfrm>
+                            <a:off x="0" y="0"/>
+                            <a:ext cx="432000" cy="432000"/>
+                          </a:xfrm>
+                          <a:prstGeom prst="rect"/>
+                        </pic:spPr>
+                      </pic:pic>
+                    </a:graphicData>
+                  </a:graphic>
+                </wp:inline>
+              </w:drawing>
+            </w:r>
+          </w:p>
+        </w:tc>
+        <w:tc>
+          <w:tcPr>
+            <w:tcW w:type="dxa" w:w="8164"/>
+            <w:vAlign w:val="center"/>
+            <w:tcMar>
+              <w:top w:w="60" w:type="dxa"/>
+              <w:left w:w="60" w:type="dxa"/>
+              <w:bottom w:w="60" w:type="dxa"/>
+              <w:right w:w="60" w:type="dxa"/>
+            </w:tcMar>
+          </w:tcPr>
+          <w:p>
+            <w:pPr>
+              <w:spacing w:after="0"/>
+            </w:pPr>
+            <w:r>
+              <w:rPr>
+                <w:rFonts w:ascii="Montserrat SemiBold" w:hAnsi="Montserrat SemiBold"/>
+                <w:sz w:val="22"/>
+              </w:rPr>
+              <w:t>State the implication</w:t>
+              <w:br/>
+            </w:r>
+            <w:r>
+              <w:rPr>
+                <w:sz w:val="20"/>
+              </w:rPr>
+              <w:t>Follow the graphic with the conclusion the reader should draw.</w:t>
+            </w:r>
+          </w:p>
+        </w:tc>
+      </w:tr>
+    </w:tbl>
+    <w:p>
+      <w:r>
+        <w:br w:type="page"/>
+      </w:r>
+    </w:p>
+    <w:p>
+      <w:bookmarkStart w:id="5" w:name="progress"/>
+      <w:pPr>
+        <w:pStyle w:val="Heading1"/>
+      </w:pPr>
+      <w:r>
+        <w:t>Progress indicators</w:t>
+      </w:r>
+      <w:bookmarkEnd w:id="5"/>
+    </w:p>
+    <w:p>
+      <w:r>
+        <w:t>Percentage rings show a share of a defined total. These examples demonstrate four values, with the explanation kept beside each graphic.</w:t>
+      </w:r>
+    </w:p>
+    <w:tbl>
+      <w:tblPr>
+        <w:tblW w:type="auto" w:w="0"/>
+        <w:tblLayout w:type="fixed"/>
+        <w:tblLook w:firstColumn="1" w:firstRow="1" w:lastColumn="0" w:lastRow="0" w:noHBand="0" w:noVBand="1" w:val="04A0"/>
+        <w:tblBorders>
+          <w:top w:val="nil"/>
+          <w:left w:val="nil"/>
+          <w:bottom w:val="nil"/>
+          <w:right w:val="nil"/>
+          <w:insideH w:val="nil"/>
+          <w:insideV w:val="nil"/>
+        </w:tblBorders>
+      </w:tblPr>
+      <w:tblGrid>
+        <w:gridCol w:w="2551"/>
+        <w:gridCol w:w="6633"/>
+      </w:tblGrid>
+      <w:tr>
+        <w:trPr>
+          <w:cantSplit/>
+          <w:trHeight w:val="2211" w:hRule="atLeast"/>
+        </w:trPr>
+        <w:tc>
+          <w:tcPr>
+            <w:tcW w:type="dxa" w:w="2551"/>
+            <w:vAlign w:val="center"/>
+            <w:tcMar>
+              <w:top w:w="60" w:type="dxa"/>
+              <w:left w:w="60" w:type="dxa"/>
+              <w:bottom w:w="60" w:type="dxa"/>
+              <w:right w:w="60" w:type="dxa"/>
+            </w:tcMar>
+          </w:tcPr>
+          <w:p>
+            <w:pPr>
+              <w:spacing w:after="0"/>
+            </w:pPr>
+            <w:r>
+              <w:drawing>
+                <wp:inline xmlns:a="http://schemas.openxmlformats.org/drawingml/2006/main" xmlns:pic="http://schemas.openxmlformats.org/drawingml/2006/picture">
+                  <wp:extent cx="1296000" cy="1296000"/>
+                  <wp:docPr id="5" name="Picture 5"/>
+                  <wp:cNvGraphicFramePr>
+                    <a:graphicFrameLocks noChangeAspect="1"/>
+                  </wp:cNvGraphicFramePr>
+                  <a:graphic>
+                    <a:graphicData uri="http://schemas.openxmlformats.org/drawingml/2006/picture">
+                      <pic:pic>
+                        <pic:nvPicPr>
+                          <pic:cNvPr id="0" name="ring-25.png"/>
+                          <pic:cNvPicPr/>
+                        </pic:nvPicPr>
+                        <pic:blipFill>
+                          <a:blip r:embed="rId18"/>
+                          <a:stretch>
+                            <a:fillRect/>
+                          </a:stretch>
+                        </pic:blipFill>
+                        <pic:spPr>
+                          <a:xfrm>
+                            <a:off x="0" y="0"/>
+                            <a:ext cx="1296000" cy="1296000"/>
+                          </a:xfrm>
+                          <a:prstGeom prst="rect"/>
+                        </pic:spPr>
+                      </pic:pic>
+                    </a:graphicData>
+                  </a:graphic>
+                </wp:inline>
+              </w:drawing>
+            </w:r>
+          </w:p>
+        </w:tc>
+        <w:tc>
+          <w:tcPr>
+            <w:tcW w:type="dxa" w:w="6633"/>
+            <w:vAlign w:val="center"/>
+            <w:tcMar>
+              <w:top w:w="60" w:type="dxa"/>
+              <w:left w:w="60" w:type="dxa"/>
+              <w:bottom w:w="60" w:type="dxa"/>
+              <w:right w:w="60" w:type="dxa"/>
+            </w:tcMar>
+          </w:tcPr>
+          <w:p>
+            <w:pPr>
+              <w:spacing w:after="0"/>
+            </w:pPr>
+            <w:r>
+              <w:rPr>
+                <w:rFonts w:ascii="Montserrat SemiBold" w:hAnsi="Montserrat SemiBold"/>
+                <w:color w:val="71218A"/>
+                <w:sz w:val="26"/>
+              </w:rPr>
+              <w:t>One quarter</w:t>
+              <w:br/>
+            </w:r>
+            <w:r>
+              <w:t>25 out of every 100 items are complete.</w:t>
+            </w:r>
+          </w:p>
+        </w:tc>
+      </w:tr>
+      <w:tr>
+        <w:trPr>
+          <w:cantSplit/>
+          <w:trHeight w:val="2211" w:hRule="atLeast"/>
+        </w:trPr>
+        <w:tc>
+          <w:tcPr>
+            <w:tcW w:type="dxa" w:w="2551"/>
+            <w:vAlign w:val="center"/>
+            <w:tcMar>
+              <w:top w:w="60" w:type="dxa"/>
+              <w:left w:w="60" w:type="dxa"/>
+              <w:bottom w:w="60" w:type="dxa"/>
+              <w:right w:w="60" w:type="dxa"/>
+            </w:tcMar>
+          </w:tcPr>
+          <w:p>
+            <w:pPr>
+              <w:spacing w:after="0"/>
+            </w:pPr>
+            <w:r>
+              <w:drawing>
+                <wp:inline xmlns:a="http://schemas.openxmlformats.org/drawingml/2006/main" xmlns:pic="http://schemas.openxmlformats.org/drawingml/2006/picture">
+                  <wp:extent cx="1296000" cy="1296000"/>
+                  <wp:docPr id="6" name="Picture 6"/>
+                  <wp:cNvGraphicFramePr>
+                    <a:graphicFrameLocks noChangeAspect="1"/>
+                  </wp:cNvGraphicFramePr>
+                  <a:graphic>
+                    <a:graphicData uri="http://schemas.openxmlformats.org/drawingml/2006/picture">
+                      <pic:pic>
+                        <pic:nvPicPr>
+                          <pic:cNvPr id="0" name="ring-50.png"/>
+                          <pic:cNvPicPr/>
+                        </pic:nvPicPr>
+                        <pic:blipFill>
+                          <a:blip r:embed="rId19"/>
+                          <a:stretch>
+                            <a:fillRect/>
+                          </a:stretch>
+                        </pic:blipFill>
+                        <pic:spPr>
+                          <a:xfrm>
+                            <a:off x="0" y="0"/>
+                            <a:ext cx="1296000" cy="1296000"/>
+                          </a:xfrm>
+                          <a:prstGeom prst="rect"/>
+                        </pic:spPr>
+                      </pic:pic>
+                    </a:graphicData>
+                  </a:graphic>
+                </wp:inline>
+              </w:drawing>
+            </w:r>
+          </w:p>
+        </w:tc>
+        <w:tc>
+          <w:tcPr>
+            <w:tcW w:type="dxa" w:w="6633"/>
+            <w:vAlign w:val="center"/>
+            <w:tcMar>
+              <w:top w:w="60" w:type="dxa"/>
+              <w:left w:w="60" w:type="dxa"/>
+              <w:bottom w:w="60" w:type="dxa"/>
+              <w:right w:w="60" w:type="dxa"/>
+            </w:tcMar>
+          </w:tcPr>
+          <w:p>
+            <w:pPr>
+              <w:spacing w:after="0"/>
+            </w:pPr>
+            <w:r>
+              <w:rPr>
+                <w:rFonts w:ascii="Montserrat SemiBold" w:hAnsi="Montserrat SemiBold"/>
+                <w:color w:val="71218A"/>
+                <w:sz w:val="26"/>
+              </w:rPr>
+              <w:t>Half</w:t>
+              <w:br/>
+            </w:r>
+            <w:r>
+              <w:t>50 out of every 100 items are complete.</w:t>
+            </w:r>
+          </w:p>
+        </w:tc>
+      </w:tr>
+      <w:tr>
+        <w:trPr>
+          <w:cantSplit/>
+          <w:trHeight w:val="2211" w:hRule="atLeast"/>
+        </w:trPr>
+        <w:tc>
+          <w:tcPr>
+            <w:tcW w:type="dxa" w:w="2551"/>
+            <w:vAlign w:val="center"/>
+            <w:tcMar>
+              <w:top w:w="60" w:type="dxa"/>
+              <w:left w:w="60" w:type="dxa"/>
+              <w:bottom w:w="60" w:type="dxa"/>
+              <w:right w:w="60" w:type="dxa"/>
+            </w:tcMar>
+          </w:tcPr>
+          <w:p>
+            <w:pPr>
+              <w:spacing w:after="0"/>
+            </w:pPr>
+            <w:r>
+              <w:drawing>
+                <wp:inline xmlns:a="http://schemas.openxmlformats.org/drawingml/2006/main" xmlns:pic="http://schemas.openxmlformats.org/drawingml/2006/picture">
+                  <wp:extent cx="1296000" cy="1296000"/>
+                  <wp:docPr id="7" name="Picture 7"/>
+                  <wp:cNvGraphicFramePr>
+                    <a:graphicFrameLocks noChangeAspect="1"/>
+                  </wp:cNvGraphicFramePr>
+                  <a:graphic>
+                    <a:graphicData uri="http://schemas.openxmlformats.org/drawingml/2006/picture">
+                      <pic:pic>
+                        <pic:nvPicPr>
+                          <pic:cNvPr id="0" name="ring-75.png"/>
+                          <pic:cNvPicPr/>
+                        </pic:nvPicPr>
+                        <pic:blipFill>
+                          <a:blip r:embed="rId20"/>
+                          <a:stretch>
+                            <a:fillRect/>
+                          </a:stretch>
+                        </pic:blipFill>
+                        <pic:spPr>
+                          <a:xfrm>
+                            <a:off x="0" y="0"/>
+                            <a:ext cx="1296000" cy="1296000"/>
+                          </a:xfrm>
+                          <a:prstGeom prst="rect"/>
+                        </pic:spPr>
+                      </pic:pic>
+                    </a:graphicData>
+                  </a:graphic>
+                </wp:inline>
+              </w:drawing>
+            </w:r>
+          </w:p>
+        </w:tc>
+        <w:tc>
+          <w:tcPr>
+            <w:tcW w:type="dxa" w:w="6633"/>
+            <w:vAlign w:val="center"/>
+            <w:tcMar>
+              <w:top w:w="60" w:type="dxa"/>
+              <w:left w:w="60" w:type="dxa"/>
+              <w:bottom w:w="60" w:type="dxa"/>
+              <w:right w:w="60" w:type="dxa"/>
+            </w:tcMar>
+          </w:tcPr>
+          <w:p>
+            <w:pPr>
+              <w:spacing w:after="0"/>
+            </w:pPr>
+            <w:r>
+              <w:rPr>
+                <w:rFonts w:ascii="Montserrat SemiBold" w:hAnsi="Montserrat SemiBold"/>
+                <w:color w:val="71218A"/>
+                <w:sz w:val="26"/>
+              </w:rPr>
+              <w:t>Three quarters</w:t>
+              <w:br/>
+            </w:r>
+            <w:r>
+              <w:t>75 out of every 100 items are complete.</w:t>
+            </w:r>
+          </w:p>
+        </w:tc>
+      </w:tr>
+      <w:tr>
+        <w:trPr>
+          <w:cantSplit/>
+          <w:trHeight w:val="2211" w:hRule="atLeast"/>
+        </w:trPr>
+        <w:tc>
+          <w:tcPr>
+            <w:tcW w:type="dxa" w:w="2551"/>
+            <w:vAlign w:val="center"/>
+            <w:tcMar>
+              <w:top w:w="60" w:type="dxa"/>
+              <w:left w:w="60" w:type="dxa"/>
+              <w:bottom w:w="60" w:type="dxa"/>
+              <w:right w:w="60" w:type="dxa"/>
+            </w:tcMar>
+          </w:tcPr>
+          <w:p>
+            <w:pPr>
+              <w:spacing w:after="0"/>
+            </w:pPr>
+            <w:r>
+              <w:drawing>
+                <wp:inline xmlns:a="http://schemas.openxmlformats.org/drawingml/2006/main" xmlns:pic="http://schemas.openxmlformats.org/drawingml/2006/picture">
+                  <wp:extent cx="1296000" cy="1296000"/>
+                  <wp:docPr id="8" name="Picture 8"/>
+                  <wp:cNvGraphicFramePr>
+                    <a:graphicFrameLocks noChangeAspect="1"/>
+                  </wp:cNvGraphicFramePr>
+                  <a:graphic>
+                    <a:graphicData uri="http://schemas.openxmlformats.org/drawingml/2006/picture">
+                      <pic:pic>
+                        <pic:nvPicPr>
+                          <pic:cNvPr id="0" name="ring-100.png"/>
+                          <pic:cNvPicPr/>
+                        </pic:nvPicPr>
+                        <pic:blipFill>
+                          <a:blip r:embed="rId21"/>
+                          <a:stretch>
+                            <a:fillRect/>
+                          </a:stretch>
+                        </pic:blipFill>
+                        <pic:spPr>
+                          <a:xfrm>
+                            <a:off x="0" y="0"/>
+                            <a:ext cx="1296000" cy="1296000"/>
+                          </a:xfrm>
+                          <a:prstGeom prst="rect"/>
+                        </pic:spPr>
+                      </pic:pic>
+                    </a:graphicData>
+                  </a:graphic>
+                </wp:inline>
+              </w:drawing>
+            </w:r>
+          </w:p>
+        </w:tc>
+        <w:tc>
+          <w:tcPr>
+            <w:tcW w:type="dxa" w:w="6633"/>
+            <w:vAlign w:val="center"/>
+            <w:tcMar>
+              <w:top w:w="60" w:type="dxa"/>
+              <w:left w:w="60" w:type="dxa"/>
+              <w:bottom w:w="60" w:type="dxa"/>
+              <w:right w:w="60" w:type="dxa"/>
+            </w:tcMar>
+          </w:tcPr>
+          <w:p>
+            <w:pPr>
+              <w:spacing w:after="0"/>
+            </w:pPr>
+            <w:r>
+              <w:rPr>
+                <w:rFonts w:ascii="Montserrat SemiBold" w:hAnsi="Montserrat SemiBold"/>
+                <w:color w:val="71218A"/>
+                <w:sz w:val="26"/>
+              </w:rPr>
+              <w:t>Complete</w:t>
+              <w:br/>
+            </w:r>
+            <w:r>
+              <w:t>All 100 items are complete; no grey remainder remains.</w:t>
+            </w:r>
+          </w:p>
+        </w:tc>
+      </w:tr>
+    </w:tbl>
+    <w:p>
+      <w:pPr>
+        <w:spacing w:before="100"/>
+      </w:pPr>
+      <w:r>
+        <w:rPr>
+          <w:color w:val="716A75"/>
+          <w:sz w:val="18"/>
+        </w:rPr>
+        <w:t>Figure 2  Illustrative percentages for layout demonstration.</w:t>
+      </w:r>
+    </w:p>
+    <w:p>
+      <w:r>
+        <w:br w:type="page"/>
+      </w:r>
+    </w:p>
+    <w:p>
+      <w:bookmarkStart w:id="6" w:name="panels"/>
+      <w:pPr>
+        <w:pStyle w:val="Heading1"/>
+      </w:pPr>
+      <w:r>
+        <w:t>Callouts and key messages</w:t>
+      </w:r>
+      <w:bookmarkEnd w:id="6"/>
+    </w:p>
+    <w:p>
+      <w:r>
+        <w:t>Coloured panels can highlight a finding, an action or a short message. Use them selectively so the main explanation remains easy to follow.</w:t>
+      </w:r>
+    </w:p>
+    <w:tbl>
+      <w:tblPr>
+        <w:tblW w:type="auto" w:w="0"/>
+        <w:tblLayout w:type="fixed"/>
+        <w:tblLook w:firstColumn="1" w:firstRow="1" w:lastColumn="0" w:lastRow="0" w:noHBand="0" w:noVBand="1" w:val="04A0"/>
+        <w:tblBorders>
+          <w:top w:val="nil"/>
+          <w:left w:val="nil"/>
+          <w:bottom w:val="nil"/>
+          <w:right w:val="nil"/>
+          <w:insideH w:val="nil"/>
+          <w:insideV w:val="nil"/>
+        </w:tblBorders>
+      </w:tblPr>
+      <w:tblGrid>
+        <w:gridCol w:w="9184"/>
+      </w:tblGrid>
+      <w:tr>
+        <w:trPr>
+          <w:cantSplit/>
+        </w:trPr>
+        <w:tc>
+          <w:tcPr>
+            <w:tcW w:type="dxa" w:w="9184"/>
+            <w:vAlign w:val="center"/>
+            <w:tcMar>
+              <w:top w:w="60" w:type="dxa"/>
+              <w:left w:w="60" w:type="dxa"/>
+              <w:bottom w:w="60" w:type="dxa"/>
+              <w:right w:w="60" w:type="dxa"/>
+            </w:tcMar>
+            <w:shd w:fill="A91F72"/>
+            <w:tcMar>
+              <w:top w:w="340" w:type="dxa"/>
+              <w:left w:w="340" w:type="dxa"/>
+              <w:bottom w:w="340" w:type="dxa"/>
+              <w:right w:w="340" w:type="dxa"/>
+            </w:tcMar>
+          </w:tcPr>
+          <w:p>
+            <w:pPr>
+              <w:spacing w:after="200"/>
+            </w:pPr>
+            <w:r>
+              <w:rPr>
+                <w:rFonts w:ascii="Montserrat Black" w:hAnsi="Montserrat Black"/>
+                <w:color w:val="FFFFFF"/>
+                <w:sz w:val="34"/>
+              </w:rPr>
+              <w:t>KEY FINDING</w:t>
+            </w:r>
+          </w:p>
+          <w:p>
+            <w:pPr>
+              <w:spacing w:after="0"/>
+            </w:pPr>
+            <w:r>
+              <w:rPr>
+                <w:color w:val="FFFFFF"/>
+                <w:sz w:val="21"/>
+              </w:rPr>
+              <w:t>A short finding should explain what matters and why. Keep the supporting evidence in the surrounding text.</w:t>
+            </w:r>
+          </w:p>
+        </w:tc>
+      </w:tr>
+    </w:tbl>
+    <w:p>
+      <w:pPr>
+        <w:spacing w:after="60"/>
+      </w:pPr>
+    </w:p>
+    <w:tbl>
+      <w:tblPr>
+        <w:tblW w:type="auto" w:w="0"/>
+        <w:tblLayout w:type="fixed"/>
+        <w:tblLook w:firstColumn="1" w:firstRow="1" w:lastColumn="0" w:lastRow="0" w:noHBand="0" w:noVBand="1" w:val="04A0"/>
+        <w:tblBorders>
+          <w:top w:val="nil"/>
+          <w:left w:val="nil"/>
+          <w:bottom w:val="nil"/>
+          <w:right w:val="nil"/>
+          <w:insideH w:val="nil"/>
+          <w:insideV w:val="nil"/>
+        </w:tblBorders>
+      </w:tblPr>
+      <w:tblGrid>
+        <w:gridCol w:w="4422"/>
+        <w:gridCol w:w="340"/>
+        <w:gridCol w:w="4422"/>
+      </w:tblGrid>
+      <w:tr>
+        <w:trPr>
+          <w:cantSplit/>
+        </w:trPr>
+        <w:tc>
+          <w:tcPr>
+            <w:tcW w:type="dxa" w:w="4422"/>
+            <w:vAlign w:val="center"/>
+            <w:tcMar>
+              <w:top w:w="60" w:type="dxa"/>
+              <w:left w:w="60" w:type="dxa"/>
+              <w:bottom w:w="60" w:type="dxa"/>
+              <w:right w:w="60" w:type="dxa"/>
+            </w:tcMar>
+            <w:shd w:fill="C02775"/>
+            <w:tcMar>
+              <w:top w:w="340" w:type="dxa"/>
+              <w:left w:w="340" w:type="dxa"/>
+              <w:bottom w:w="340" w:type="dxa"/>
+              <w:right w:w="340" w:type="dxa"/>
+            </w:tcMar>
+          </w:tcPr>
+          <w:p>
+            <w:pPr>
+              <w:spacing w:after="200"/>
+            </w:pPr>
+            <w:r>
+              <w:rPr>
+                <w:rFonts w:ascii="Montserrat Black" w:hAnsi="Montserrat Black"/>
+                <w:color w:val="FFFFFF"/>
+                <w:sz w:val="34"/>
+              </w:rPr>
+              <w:t>PURPOSE</w:t>
+            </w:r>
+          </w:p>
+          <w:p>
+            <w:pPr>
+              <w:spacing w:after="0"/>
+            </w:pPr>
+            <w:r>
+              <w:rPr>
+                <w:color w:val="FFFFFF"/>
+                <w:sz w:val="21"/>
+              </w:rPr>
+              <w:t>Give the reader enough context to understand the document.</w:t>
+            </w:r>
+          </w:p>
+        </w:tc>
+        <w:tc>
+          <w:tcPr>
+            <w:tcW w:type="dxa" w:w="340"/>
+            <w:vAlign w:val="center"/>
+            <w:tcMar>
+              <w:top w:w="60" w:type="dxa"/>
+              <w:left w:w="60" w:type="dxa"/>
+              <w:bottom w:w="60" w:type="dxa"/>
+              <w:right w:w="60" w:type="dxa"/>
+            </w:tcMar>
+          </w:tcPr>
+          <w:p>
+            <w:pPr>
+              <w:spacing w:after="0"/>
+            </w:pPr>
+          </w:p>
+        </w:tc>
+        <w:tc>
+          <w:tcPr>
+            <w:tcW w:type="dxa" w:w="4422"/>
+            <w:vAlign w:val="center"/>
+            <w:tcMar>
+              <w:top w:w="60" w:type="dxa"/>
+              <w:left w:w="60" w:type="dxa"/>
+              <w:bottom w:w="60" w:type="dxa"/>
+              <w:right w:w="60" w:type="dxa"/>
+            </w:tcMar>
+            <w:shd w:fill="71218A"/>
+            <w:tcMar>
+              <w:top w:w="340" w:type="dxa"/>
+              <w:left w:w="340" w:type="dxa"/>
+              <w:bottom w:w="340" w:type="dxa"/>
+              <w:right w:w="340" w:type="dxa"/>
+            </w:tcMar>
+          </w:tcPr>
+          <w:p>
+            <w:pPr>
+              <w:spacing w:after="200"/>
+            </w:pPr>
+            <w:r>
+              <w:rPr>
+                <w:rFonts w:ascii="Montserrat Black" w:hAnsi="Montserrat Black"/>
+                <w:color w:val="FFFFFF"/>
+                <w:sz w:val="34"/>
+              </w:rPr>
+              <w:t>NEXT STEP</w:t>
+            </w:r>
+          </w:p>
+          <w:p>
+            <w:pPr>
+              <w:spacing w:after="0"/>
+            </w:pPr>
+            <w:r>
+              <w:rPr>
+                <w:color w:val="FFFFFF"/>
+                <w:sz w:val="21"/>
+              </w:rPr>
+              <w:t>Make the requested action clear and specific.</w:t>
+            </w:r>
+          </w:p>
+        </w:tc>
+      </w:tr>
+    </w:tbl>
+    <w:p>
+      <w:pPr>
+        <w:pStyle w:val="Heading2"/>
+      </w:pPr>
+      <w:r>
+        <w:t>A quieter supporting note</w:t>
+      </w:r>
+    </w:p>
+    <w:p>
+      <w:pPr>
+        <w:shd w:fill="F5F0F7"/>
+      </w:pPr>
+      <w:r>
+        <w:t>Use a pale purple note for useful supporting information that does not need the prominence of a saturated panel.</w:t>
+      </w:r>
+    </w:p>
+    <w:p>
+      <w:pPr>
+        <w:pStyle w:val="Heading2"/>
+      </w:pPr>
+      <w:r>
+        <w:t>Quotations</w:t>
+      </w:r>
+    </w:p>
+    <w:p>
+      <w:r>
+        <w:t>A quotation card uses the same pink or purple treatment with white quotation marks and a clear speaker attribution. Use it only for a genuine sourced quotation; these message cards intentionally contain no invented quote.</w:t>
+      </w:r>
+    </w:p>
+    <w:p>
       <w:pPr>
         <w:sectPr>
           <w:footerReference w:type="default" r:id="rId11"/>

</xml_diff>